<commit_message>
Added summary of great dissertations and proposals
</commit_message>
<xml_diff>
--- a/Capstone Project.docx
+++ b/Capstone Project.docx
@@ -120,6 +120,118 @@
       </w:r>
     </w:p>
     <w:p>
+      <w:r>
+        <w:rPr>
+          <w:b/>
+          <w:bCs/>
+        </w:rPr>
+        <w:lastRenderedPageBreak/>
+        <w:t xml:space="preserve">Statement of Originality and Finality </w:t>
+      </w:r>
+    </w:p>
+    <w:p>
+      <w:r>
+        <w:t xml:space="preserve">In presenting this dissertation for assessment, I declare that it is a final copy including last revisions. I also declare that it is entirely the result of my own work other than where sources are explicitly acknowledged and referenced within the body of the text. This dissertation has not been previously submitted, in whole or in substantial part, for any degree at this or any other institution. </w:t>
+      </w:r>
+    </w:p>
+    <w:p>
+      <w:r>
+        <w:t>M</w:t>
+      </w:r>
+      <w:r>
+        <w:t>artin Bittner</w:t>
+      </w:r>
+    </w:p>
+    <w:p>
+      <w:r>
+        <w:t>August</w:t>
+      </w:r>
+      <w:r>
+        <w:t xml:space="preserve"> 20</w:t>
+      </w:r>
+      <w:r>
+        <w:t>27</w:t>
+      </w:r>
+      <w:r>
+        <w:t xml:space="preserve"> </w:t>
+      </w:r>
+    </w:p>
+    <w:p/>
+    <w:p/>
+    <w:p/>
+    <w:p/>
+    <w:p>
+      <w:r>
+        <w:t xml:space="preserve">© </w:t>
+      </w:r>
+      <w:r>
+        <w:t xml:space="preserve">Martin Bittner </w:t>
+      </w:r>
+      <w:r>
+        <w:t>20</w:t>
+      </w:r>
+      <w:r>
+        <w:t>27</w:t>
+      </w:r>
+    </w:p>
+    <w:p>
+      <w:r>
+        <w:t xml:space="preserve">This material is copyright of the author. It is reproduced here by permission. Further reproduction without the explicit permission of the author is prohibited. </w:t>
+      </w:r>
+    </w:p>
+    <w:p/>
+    <w:p/>
+    <w:p/>
+    <w:p>
+      <w:r>
+        <w:t xml:space="preserve">If you are citing this work, please refer to it as: </w:t>
+      </w:r>
+    </w:p>
+    <w:p>
+      <w:pPr>
+        <w:rPr>
+          <w:rFonts w:asciiTheme="majorHAnsi" w:eastAsiaTheme="majorEastAsia" w:hAnsiTheme="majorHAnsi" w:cstheme="majorBidi"/>
+          <w:color w:val="0F4761" w:themeColor="accent1" w:themeShade="BF"/>
+          <w:sz w:val="40"/>
+          <w:szCs w:val="40"/>
+        </w:rPr>
+      </w:pPr>
+      <w:r>
+        <w:t>Martin Bittner 2027</w:t>
+      </w:r>
+      <w:r>
+        <w:t xml:space="preserve"> </w:t>
+      </w:r>
+      <w:r>
+        <w:rPr>
+          <w:highlight w:val="yellow"/>
+        </w:rPr>
+        <w:t>The title of my capstone Project will be here once it has been decided by its author</w:t>
+      </w:r>
+      <w:r>
+        <w:t>, Dissertation submitted for the award of M</w:t>
+      </w:r>
+      <w:r>
+        <w:t>B</w:t>
+      </w:r>
+      <w:r>
+        <w:t>A Leading Innovation and Change; York St John University</w:t>
+      </w:r>
+    </w:p>
+    <w:p>
+      <w:pPr>
+        <w:rPr>
+          <w:rFonts w:asciiTheme="majorHAnsi" w:eastAsiaTheme="majorEastAsia" w:hAnsiTheme="majorHAnsi" w:cstheme="majorBidi"/>
+          <w:color w:val="0F4761" w:themeColor="accent1" w:themeShade="BF"/>
+          <w:sz w:val="40"/>
+          <w:szCs w:val="40"/>
+        </w:rPr>
+      </w:pPr>
+      <w:r>
+        <w:br w:type="page"/>
+      </w:r>
+    </w:p>
+    <w:p>
       <w:pPr>
         <w:pStyle w:val="Heading1"/>
         <w:numPr>
@@ -127,7 +239,7 @@
           <w:numId w:val="0"/>
         </w:numPr>
       </w:pPr>
-      <w:bookmarkStart w:id="0" w:name="_Toc236297736"/>
+      <w:bookmarkStart w:id="0" w:name="_Toc236299284"/>
       <w:r>
         <w:lastRenderedPageBreak/>
         <w:t>Abstract</w:t>
@@ -144,7 +256,7 @@
         <w:br w:type="page"/>
       </w:r>
     </w:p>
-    <w:bookmarkStart w:id="1" w:name="_Toc236297737" w:displacedByCustomXml="next"/>
+    <w:bookmarkStart w:id="1" w:name="_Toc236299285" w:displacedByCustomXml="next"/>
     <w:sdt>
       <w:sdtPr>
         <w:id w:val="1472247903"/>
@@ -194,7 +306,7 @@
           <w:r>
             <w:fldChar w:fldCharType="separate"/>
           </w:r>
-          <w:hyperlink w:anchor="_Toc236297736" w:history="1">
+          <w:hyperlink w:anchor="_Toc236299284" w:history="1">
             <w:r>
               <w:rPr>
                 <w:rStyle w:val="Hyperlink"/>
@@ -221,7 +333,7 @@
                 <w:noProof/>
                 <w:webHidden/>
               </w:rPr>
-              <w:instrText xml:space="preserve"> PAGEREF _Toc236297736 \h </w:instrText>
+              <w:instrText xml:space="preserve"> PAGEREF _Toc236299284 \h </w:instrText>
             </w:r>
             <w:r>
               <w:rPr>
@@ -241,7 +353,7 @@
                 <w:noProof/>
                 <w:webHidden/>
               </w:rPr>
-              <w:t>2</w:t>
+              <w:t>3</w:t>
             </w:r>
             <w:r>
               <w:rPr>
@@ -261,7 +373,7 @@
               <w:lang w:val="fr-CA" w:eastAsia="fr-CA"/>
             </w:rPr>
           </w:pPr>
-          <w:hyperlink w:anchor="_Toc236297737" w:history="1">
+          <w:hyperlink w:anchor="_Toc236299285" w:history="1">
             <w:r>
               <w:rPr>
                 <w:rStyle w:val="Hyperlink"/>
@@ -288,7 +400,7 @@
                 <w:noProof/>
                 <w:webHidden/>
               </w:rPr>
-              <w:instrText xml:space="preserve"> PAGEREF _Toc236297737 \h </w:instrText>
+              <w:instrText xml:space="preserve"> PAGEREF _Toc236299285 \h </w:instrText>
             </w:r>
             <w:r>
               <w:rPr>
@@ -308,7 +420,7 @@
                 <w:noProof/>
                 <w:webHidden/>
               </w:rPr>
-              <w:t>3</w:t>
+              <w:t>4</w:t>
             </w:r>
             <w:r>
               <w:rPr>
@@ -328,7 +440,7 @@
               <w:lang w:val="fr-CA" w:eastAsia="fr-CA"/>
             </w:rPr>
           </w:pPr>
-          <w:hyperlink w:anchor="_Toc236297738" w:history="1">
+          <w:hyperlink w:anchor="_Toc236299286" w:history="1">
             <w:r>
               <w:rPr>
                 <w:rStyle w:val="Hyperlink"/>
@@ -355,7 +467,7 @@
                 <w:noProof/>
                 <w:webHidden/>
               </w:rPr>
-              <w:instrText xml:space="preserve"> PAGEREF _Toc236297738 \h </w:instrText>
+              <w:instrText xml:space="preserve"> PAGEREF _Toc236299286 \h </w:instrText>
             </w:r>
             <w:r>
               <w:rPr>
@@ -375,7 +487,7 @@
                 <w:noProof/>
                 <w:webHidden/>
               </w:rPr>
-              <w:t>5</w:t>
+              <w:t>6</w:t>
             </w:r>
             <w:r>
               <w:rPr>
@@ -398,7 +510,7 @@
               <w:lang w:val="fr-CA" w:eastAsia="fr-CA"/>
             </w:rPr>
           </w:pPr>
-          <w:hyperlink w:anchor="_Toc236297739" w:history="1">
+          <w:hyperlink w:anchor="_Toc236299287" w:history="1">
             <w:r>
               <w:rPr>
                 <w:rStyle w:val="Hyperlink"/>
@@ -440,7 +552,7 @@
                 <w:noProof/>
                 <w:webHidden/>
               </w:rPr>
-              <w:instrText xml:space="preserve"> PAGEREF _Toc236297739 \h </w:instrText>
+              <w:instrText xml:space="preserve"> PAGEREF _Toc236299287 \h </w:instrText>
             </w:r>
             <w:r>
               <w:rPr>
@@ -460,7 +572,7 @@
                 <w:noProof/>
                 <w:webHidden/>
               </w:rPr>
-              <w:t>6</w:t>
+              <w:t>7</w:t>
             </w:r>
             <w:r>
               <w:rPr>
@@ -484,7 +596,7 @@
               <w:lang w:val="fr-CA" w:eastAsia="fr-CA"/>
             </w:rPr>
           </w:pPr>
-          <w:hyperlink w:anchor="_Toc236297740" w:history="1">
+          <w:hyperlink w:anchor="_Toc236299288" w:history="1">
             <w:r>
               <w:rPr>
                 <w:rStyle w:val="Hyperlink"/>
@@ -526,7 +638,7 @@
                 <w:noProof/>
                 <w:webHidden/>
               </w:rPr>
-              <w:instrText xml:space="preserve"> PAGEREF _Toc236297740 \h </w:instrText>
+              <w:instrText xml:space="preserve"> PAGEREF _Toc236299288 \h </w:instrText>
             </w:r>
             <w:r>
               <w:rPr>
@@ -546,7 +658,7 @@
                 <w:noProof/>
                 <w:webHidden/>
               </w:rPr>
-              <w:t>6</w:t>
+              <w:t>7</w:t>
             </w:r>
             <w:r>
               <w:rPr>
@@ -570,7 +682,7 @@
               <w:lang w:val="fr-CA" w:eastAsia="fr-CA"/>
             </w:rPr>
           </w:pPr>
-          <w:hyperlink w:anchor="_Toc236297741" w:history="1">
+          <w:hyperlink w:anchor="_Toc236299289" w:history="1">
             <w:r>
               <w:rPr>
                 <w:rStyle w:val="Hyperlink"/>
@@ -612,7 +724,7 @@
                 <w:noProof/>
                 <w:webHidden/>
               </w:rPr>
-              <w:instrText xml:space="preserve"> PAGEREF _Toc236297741 \h </w:instrText>
+              <w:instrText xml:space="preserve"> PAGEREF _Toc236299289 \h </w:instrText>
             </w:r>
             <w:r>
               <w:rPr>
@@ -632,7 +744,7 @@
                 <w:noProof/>
                 <w:webHidden/>
               </w:rPr>
-              <w:t>6</w:t>
+              <w:t>7</w:t>
             </w:r>
             <w:r>
               <w:rPr>
@@ -656,7 +768,7 @@
               <w:lang w:val="fr-CA" w:eastAsia="fr-CA"/>
             </w:rPr>
           </w:pPr>
-          <w:hyperlink w:anchor="_Toc236297742" w:history="1">
+          <w:hyperlink w:anchor="_Toc236299290" w:history="1">
             <w:r>
               <w:rPr>
                 <w:rStyle w:val="Hyperlink"/>
@@ -698,7 +810,7 @@
                 <w:noProof/>
                 <w:webHidden/>
               </w:rPr>
-              <w:instrText xml:space="preserve"> PAGEREF _Toc236297742 \h </w:instrText>
+              <w:instrText xml:space="preserve"> PAGEREF _Toc236299290 \h </w:instrText>
             </w:r>
             <w:r>
               <w:rPr>
@@ -718,7 +830,7 @@
                 <w:noProof/>
                 <w:webHidden/>
               </w:rPr>
-              <w:t>6</w:t>
+              <w:t>7</w:t>
             </w:r>
             <w:r>
               <w:rPr>
@@ -742,7 +854,7 @@
               <w:lang w:val="fr-CA" w:eastAsia="fr-CA"/>
             </w:rPr>
           </w:pPr>
-          <w:hyperlink w:anchor="_Toc236297743" w:history="1">
+          <w:hyperlink w:anchor="_Toc236299291" w:history="1">
             <w:r>
               <w:rPr>
                 <w:rStyle w:val="Hyperlink"/>
@@ -784,7 +896,7 @@
                 <w:noProof/>
                 <w:webHidden/>
               </w:rPr>
-              <w:instrText xml:space="preserve"> PAGEREF _Toc236297743 \h </w:instrText>
+              <w:instrText xml:space="preserve"> PAGEREF _Toc236299291 \h </w:instrText>
             </w:r>
             <w:r>
               <w:rPr>
@@ -804,7 +916,7 @@
                 <w:noProof/>
                 <w:webHidden/>
               </w:rPr>
-              <w:t>6</w:t>
+              <w:t>7</w:t>
             </w:r>
             <w:r>
               <w:rPr>
@@ -827,7 +939,7 @@
               <w:lang w:val="fr-CA" w:eastAsia="fr-CA"/>
             </w:rPr>
           </w:pPr>
-          <w:hyperlink w:anchor="_Toc236297744" w:history="1">
+          <w:hyperlink w:anchor="_Toc236299292" w:history="1">
             <w:r>
               <w:rPr>
                 <w:rStyle w:val="Hyperlink"/>
@@ -869,7 +981,7 @@
                 <w:noProof/>
                 <w:webHidden/>
               </w:rPr>
-              <w:instrText xml:space="preserve"> PAGEREF _Toc236297744 \h </w:instrText>
+              <w:instrText xml:space="preserve"> PAGEREF _Toc236299292 \h </w:instrText>
             </w:r>
             <w:r>
               <w:rPr>
@@ -889,7 +1001,7 @@
                 <w:noProof/>
                 <w:webHidden/>
               </w:rPr>
-              <w:t>7</w:t>
+              <w:t>8</w:t>
             </w:r>
             <w:r>
               <w:rPr>
@@ -913,7 +1025,7 @@
               <w:lang w:val="fr-CA" w:eastAsia="fr-CA"/>
             </w:rPr>
           </w:pPr>
-          <w:hyperlink w:anchor="_Toc236297745" w:history="1">
+          <w:hyperlink w:anchor="_Toc236299293" w:history="1">
             <w:r>
               <w:rPr>
                 <w:rStyle w:val="Hyperlink"/>
@@ -955,7 +1067,7 @@
                 <w:noProof/>
                 <w:webHidden/>
               </w:rPr>
-              <w:instrText xml:space="preserve"> PAGEREF _Toc236297745 \h </w:instrText>
+              <w:instrText xml:space="preserve"> PAGEREF _Toc236299293 \h </w:instrText>
             </w:r>
             <w:r>
               <w:rPr>
@@ -975,7 +1087,7 @@
                 <w:noProof/>
                 <w:webHidden/>
               </w:rPr>
-              <w:t>7</w:t>
+              <w:t>8</w:t>
             </w:r>
             <w:r>
               <w:rPr>
@@ -999,7 +1111,7 @@
               <w:lang w:val="fr-CA" w:eastAsia="fr-CA"/>
             </w:rPr>
           </w:pPr>
-          <w:hyperlink w:anchor="_Toc236297746" w:history="1">
+          <w:hyperlink w:anchor="_Toc236299294" w:history="1">
             <w:r>
               <w:rPr>
                 <w:rStyle w:val="Hyperlink"/>
@@ -1041,7 +1153,7 @@
                 <w:noProof/>
                 <w:webHidden/>
               </w:rPr>
-              <w:instrText xml:space="preserve"> PAGEREF _Toc236297746 \h </w:instrText>
+              <w:instrText xml:space="preserve"> PAGEREF _Toc236299294 \h </w:instrText>
             </w:r>
             <w:r>
               <w:rPr>
@@ -1061,7 +1173,7 @@
                 <w:noProof/>
                 <w:webHidden/>
               </w:rPr>
-              <w:t>7</w:t>
+              <w:t>8</w:t>
             </w:r>
             <w:r>
               <w:rPr>
@@ -1085,7 +1197,7 @@
               <w:lang w:val="fr-CA" w:eastAsia="fr-CA"/>
             </w:rPr>
           </w:pPr>
-          <w:hyperlink w:anchor="_Toc236297747" w:history="1">
+          <w:hyperlink w:anchor="_Toc236299295" w:history="1">
             <w:r>
               <w:rPr>
                 <w:rStyle w:val="Hyperlink"/>
@@ -1127,7 +1239,7 @@
                 <w:noProof/>
                 <w:webHidden/>
               </w:rPr>
-              <w:instrText xml:space="preserve"> PAGEREF _Toc236297747 \h </w:instrText>
+              <w:instrText xml:space="preserve"> PAGEREF _Toc236299295 \h </w:instrText>
             </w:r>
             <w:r>
               <w:rPr>
@@ -1147,7 +1259,7 @@
                 <w:noProof/>
                 <w:webHidden/>
               </w:rPr>
-              <w:t>7</w:t>
+              <w:t>8</w:t>
             </w:r>
             <w:r>
               <w:rPr>
@@ -1171,7 +1283,7 @@
               <w:lang w:val="fr-CA" w:eastAsia="fr-CA"/>
             </w:rPr>
           </w:pPr>
-          <w:hyperlink w:anchor="_Toc236297748" w:history="1">
+          <w:hyperlink w:anchor="_Toc236299296" w:history="1">
             <w:r>
               <w:rPr>
                 <w:rStyle w:val="Hyperlink"/>
@@ -1213,7 +1325,7 @@
                 <w:noProof/>
                 <w:webHidden/>
               </w:rPr>
-              <w:instrText xml:space="preserve"> PAGEREF _Toc236297748 \h </w:instrText>
+              <w:instrText xml:space="preserve"> PAGEREF _Toc236299296 \h </w:instrText>
             </w:r>
             <w:r>
               <w:rPr>
@@ -1233,7 +1345,7 @@
                 <w:noProof/>
                 <w:webHidden/>
               </w:rPr>
-              <w:t>7</w:t>
+              <w:t>8</w:t>
             </w:r>
             <w:r>
               <w:rPr>
@@ -1256,7 +1368,7 @@
               <w:lang w:val="fr-CA" w:eastAsia="fr-CA"/>
             </w:rPr>
           </w:pPr>
-          <w:hyperlink w:anchor="_Toc236297749" w:history="1">
+          <w:hyperlink w:anchor="_Toc236299297" w:history="1">
             <w:r>
               <w:rPr>
                 <w:rStyle w:val="Hyperlink"/>
@@ -1298,7 +1410,7 @@
                 <w:noProof/>
                 <w:webHidden/>
               </w:rPr>
-              <w:instrText xml:space="preserve"> PAGEREF _Toc236297749 \h </w:instrText>
+              <w:instrText xml:space="preserve"> PAGEREF _Toc236299297 \h </w:instrText>
             </w:r>
             <w:r>
               <w:rPr>
@@ -1318,7 +1430,7 @@
                 <w:noProof/>
                 <w:webHidden/>
               </w:rPr>
-              <w:t>8</w:t>
+              <w:t>9</w:t>
             </w:r>
             <w:r>
               <w:rPr>
@@ -1342,7 +1454,7 @@
               <w:lang w:val="fr-CA" w:eastAsia="fr-CA"/>
             </w:rPr>
           </w:pPr>
-          <w:hyperlink w:anchor="_Toc236297750" w:history="1">
+          <w:hyperlink w:anchor="_Toc236299298" w:history="1">
             <w:r>
               <w:rPr>
                 <w:rStyle w:val="Hyperlink"/>
@@ -1384,7 +1496,7 @@
                 <w:noProof/>
                 <w:webHidden/>
               </w:rPr>
-              <w:instrText xml:space="preserve"> PAGEREF _Toc236297750 \h </w:instrText>
+              <w:instrText xml:space="preserve"> PAGEREF _Toc236299298 \h </w:instrText>
             </w:r>
             <w:r>
               <w:rPr>
@@ -1404,7 +1516,7 @@
                 <w:noProof/>
                 <w:webHidden/>
               </w:rPr>
-              <w:t>8</w:t>
+              <w:t>9</w:t>
             </w:r>
             <w:r>
               <w:rPr>
@@ -1428,7 +1540,7 @@
               <w:lang w:val="fr-CA" w:eastAsia="fr-CA"/>
             </w:rPr>
           </w:pPr>
-          <w:hyperlink w:anchor="_Toc236297751" w:history="1">
+          <w:hyperlink w:anchor="_Toc236299299" w:history="1">
             <w:r>
               <w:rPr>
                 <w:rStyle w:val="Hyperlink"/>
@@ -1470,7 +1582,7 @@
                 <w:noProof/>
                 <w:webHidden/>
               </w:rPr>
-              <w:instrText xml:space="preserve"> PAGEREF _Toc236297751 \h </w:instrText>
+              <w:instrText xml:space="preserve"> PAGEREF _Toc236299299 \h </w:instrText>
             </w:r>
             <w:r>
               <w:rPr>
@@ -1490,7 +1602,7 @@
                 <w:noProof/>
                 <w:webHidden/>
               </w:rPr>
-              <w:t>8</w:t>
+              <w:t>9</w:t>
             </w:r>
             <w:r>
               <w:rPr>
@@ -1514,7 +1626,7 @@
               <w:lang w:val="fr-CA" w:eastAsia="fr-CA"/>
             </w:rPr>
           </w:pPr>
-          <w:hyperlink w:anchor="_Toc236297752" w:history="1">
+          <w:hyperlink w:anchor="_Toc236299300" w:history="1">
             <w:r>
               <w:rPr>
                 <w:rStyle w:val="Hyperlink"/>
@@ -1556,7 +1668,7 @@
                 <w:noProof/>
                 <w:webHidden/>
               </w:rPr>
-              <w:instrText xml:space="preserve"> PAGEREF _Toc236297752 \h </w:instrText>
+              <w:instrText xml:space="preserve"> PAGEREF _Toc236299300 \h </w:instrText>
             </w:r>
             <w:r>
               <w:rPr>
@@ -1576,7 +1688,7 @@
                 <w:noProof/>
                 <w:webHidden/>
               </w:rPr>
-              <w:t>8</w:t>
+              <w:t>9</w:t>
             </w:r>
             <w:r>
               <w:rPr>
@@ -1600,7 +1712,7 @@
               <w:lang w:val="fr-CA" w:eastAsia="fr-CA"/>
             </w:rPr>
           </w:pPr>
-          <w:hyperlink w:anchor="_Toc236297753" w:history="1">
+          <w:hyperlink w:anchor="_Toc236299301" w:history="1">
             <w:r>
               <w:rPr>
                 <w:rStyle w:val="Hyperlink"/>
@@ -1642,7 +1754,7 @@
                 <w:noProof/>
                 <w:webHidden/>
               </w:rPr>
-              <w:instrText xml:space="preserve"> PAGEREF _Toc236297753 \h </w:instrText>
+              <w:instrText xml:space="preserve"> PAGEREF _Toc236299301 \h </w:instrText>
             </w:r>
             <w:r>
               <w:rPr>
@@ -1662,7 +1774,7 @@
                 <w:noProof/>
                 <w:webHidden/>
               </w:rPr>
-              <w:t>8</w:t>
+              <w:t>9</w:t>
             </w:r>
             <w:r>
               <w:rPr>
@@ -1686,7 +1798,7 @@
               <w:lang w:val="fr-CA" w:eastAsia="fr-CA"/>
             </w:rPr>
           </w:pPr>
-          <w:hyperlink w:anchor="_Toc236297754" w:history="1">
+          <w:hyperlink w:anchor="_Toc236299302" w:history="1">
             <w:r>
               <w:rPr>
                 <w:rStyle w:val="Hyperlink"/>
@@ -1728,7 +1840,7 @@
                 <w:noProof/>
                 <w:webHidden/>
               </w:rPr>
-              <w:instrText xml:space="preserve"> PAGEREF _Toc236297754 \h </w:instrText>
+              <w:instrText xml:space="preserve"> PAGEREF _Toc236299302 \h </w:instrText>
             </w:r>
             <w:r>
               <w:rPr>
@@ -1748,7 +1860,7 @@
                 <w:noProof/>
                 <w:webHidden/>
               </w:rPr>
-              <w:t>8</w:t>
+              <w:t>9</w:t>
             </w:r>
             <w:r>
               <w:rPr>
@@ -1771,7 +1883,7 @@
               <w:lang w:val="fr-CA" w:eastAsia="fr-CA"/>
             </w:rPr>
           </w:pPr>
-          <w:hyperlink w:anchor="_Toc236297755" w:history="1">
+          <w:hyperlink w:anchor="_Toc236299303" w:history="1">
             <w:r>
               <w:rPr>
                 <w:rStyle w:val="Hyperlink"/>
@@ -1813,7 +1925,7 @@
                 <w:noProof/>
                 <w:webHidden/>
               </w:rPr>
-              <w:instrText xml:space="preserve"> PAGEREF _Toc236297755 \h </w:instrText>
+              <w:instrText xml:space="preserve"> PAGEREF _Toc236299303 \h </w:instrText>
             </w:r>
             <w:r>
               <w:rPr>
@@ -1833,7 +1945,7 @@
                 <w:noProof/>
                 <w:webHidden/>
               </w:rPr>
-              <w:t>9</w:t>
+              <w:t>10</w:t>
             </w:r>
             <w:r>
               <w:rPr>
@@ -1857,7 +1969,7 @@
               <w:lang w:val="fr-CA" w:eastAsia="fr-CA"/>
             </w:rPr>
           </w:pPr>
-          <w:hyperlink w:anchor="_Toc236297756" w:history="1">
+          <w:hyperlink w:anchor="_Toc236299304" w:history="1">
             <w:r>
               <w:rPr>
                 <w:rStyle w:val="Hyperlink"/>
@@ -1899,7 +2011,7 @@
                 <w:noProof/>
                 <w:webHidden/>
               </w:rPr>
-              <w:instrText xml:space="preserve"> PAGEREF _Toc236297756 \h </w:instrText>
+              <w:instrText xml:space="preserve"> PAGEREF _Toc236299304 \h </w:instrText>
             </w:r>
             <w:r>
               <w:rPr>
@@ -1919,7 +2031,7 @@
                 <w:noProof/>
                 <w:webHidden/>
               </w:rPr>
-              <w:t>9</w:t>
+              <w:t>10</w:t>
             </w:r>
             <w:r>
               <w:rPr>
@@ -1943,7 +2055,7 @@
               <w:lang w:val="fr-CA" w:eastAsia="fr-CA"/>
             </w:rPr>
           </w:pPr>
-          <w:hyperlink w:anchor="_Toc236297757" w:history="1">
+          <w:hyperlink w:anchor="_Toc236299305" w:history="1">
             <w:r>
               <w:rPr>
                 <w:rStyle w:val="Hyperlink"/>
@@ -1985,7 +2097,7 @@
                 <w:noProof/>
                 <w:webHidden/>
               </w:rPr>
-              <w:instrText xml:space="preserve"> PAGEREF _Toc236297757 \h </w:instrText>
+              <w:instrText xml:space="preserve"> PAGEREF _Toc236299305 \h </w:instrText>
             </w:r>
             <w:r>
               <w:rPr>
@@ -2005,7 +2117,7 @@
                 <w:noProof/>
                 <w:webHidden/>
               </w:rPr>
-              <w:t>9</w:t>
+              <w:t>10</w:t>
             </w:r>
             <w:r>
               <w:rPr>
@@ -2029,7 +2141,7 @@
               <w:lang w:val="fr-CA" w:eastAsia="fr-CA"/>
             </w:rPr>
           </w:pPr>
-          <w:hyperlink w:anchor="_Toc236297758" w:history="1">
+          <w:hyperlink w:anchor="_Toc236299306" w:history="1">
             <w:r>
               <w:rPr>
                 <w:rStyle w:val="Hyperlink"/>
@@ -2071,7 +2183,7 @@
                 <w:noProof/>
                 <w:webHidden/>
               </w:rPr>
-              <w:instrText xml:space="preserve"> PAGEREF _Toc236297758 \h </w:instrText>
+              <w:instrText xml:space="preserve"> PAGEREF _Toc236299306 \h </w:instrText>
             </w:r>
             <w:r>
               <w:rPr>
@@ -2091,7 +2203,7 @@
                 <w:noProof/>
                 <w:webHidden/>
               </w:rPr>
-              <w:t>9</w:t>
+              <w:t>10</w:t>
             </w:r>
             <w:r>
               <w:rPr>
@@ -2114,7 +2226,7 @@
               <w:lang w:val="fr-CA" w:eastAsia="fr-CA"/>
             </w:rPr>
           </w:pPr>
-          <w:hyperlink w:anchor="_Toc236297759" w:history="1">
+          <w:hyperlink w:anchor="_Toc236299307" w:history="1">
             <w:r>
               <w:rPr>
                 <w:rStyle w:val="Hyperlink"/>
@@ -2156,7 +2268,7 @@
                 <w:noProof/>
                 <w:webHidden/>
               </w:rPr>
-              <w:instrText xml:space="preserve"> PAGEREF _Toc236297759 \h </w:instrText>
+              <w:instrText xml:space="preserve"> PAGEREF _Toc236299307 \h </w:instrText>
             </w:r>
             <w:r>
               <w:rPr>
@@ -2176,7 +2288,7 @@
                 <w:noProof/>
                 <w:webHidden/>
               </w:rPr>
-              <w:t>10</w:t>
+              <w:t>11</w:t>
             </w:r>
             <w:r>
               <w:rPr>
@@ -2200,7 +2312,7 @@
               <w:lang w:val="fr-CA" w:eastAsia="fr-CA"/>
             </w:rPr>
           </w:pPr>
-          <w:hyperlink w:anchor="_Toc236297760" w:history="1">
+          <w:hyperlink w:anchor="_Toc236299308" w:history="1">
             <w:r>
               <w:rPr>
                 <w:rStyle w:val="Hyperlink"/>
@@ -2242,7 +2354,7 @@
                 <w:noProof/>
                 <w:webHidden/>
               </w:rPr>
-              <w:instrText xml:space="preserve"> PAGEREF _Toc236297760 \h </w:instrText>
+              <w:instrText xml:space="preserve"> PAGEREF _Toc236299308 \h </w:instrText>
             </w:r>
             <w:r>
               <w:rPr>
@@ -2262,7 +2374,7 @@
                 <w:noProof/>
                 <w:webHidden/>
               </w:rPr>
-              <w:t>10</w:t>
+              <w:t>11</w:t>
             </w:r>
             <w:r>
               <w:rPr>
@@ -2286,7 +2398,7 @@
               <w:lang w:val="fr-CA" w:eastAsia="fr-CA"/>
             </w:rPr>
           </w:pPr>
-          <w:hyperlink w:anchor="_Toc236297761" w:history="1">
+          <w:hyperlink w:anchor="_Toc236299309" w:history="1">
             <w:r>
               <w:rPr>
                 <w:rStyle w:val="Hyperlink"/>
@@ -2328,7 +2440,7 @@
                 <w:noProof/>
                 <w:webHidden/>
               </w:rPr>
-              <w:instrText xml:space="preserve"> PAGEREF _Toc236297761 \h </w:instrText>
+              <w:instrText xml:space="preserve"> PAGEREF _Toc236299309 \h </w:instrText>
             </w:r>
             <w:r>
               <w:rPr>
@@ -2348,7 +2460,7 @@
                 <w:noProof/>
                 <w:webHidden/>
               </w:rPr>
-              <w:t>10</w:t>
+              <w:t>11</w:t>
             </w:r>
             <w:r>
               <w:rPr>
@@ -2372,7 +2484,7 @@
               <w:lang w:val="fr-CA" w:eastAsia="fr-CA"/>
             </w:rPr>
           </w:pPr>
-          <w:hyperlink w:anchor="_Toc236297762" w:history="1">
+          <w:hyperlink w:anchor="_Toc236299310" w:history="1">
             <w:r>
               <w:rPr>
                 <w:rStyle w:val="Hyperlink"/>
@@ -2414,7 +2526,7 @@
                 <w:noProof/>
                 <w:webHidden/>
               </w:rPr>
-              <w:instrText xml:space="preserve"> PAGEREF _Toc236297762 \h </w:instrText>
+              <w:instrText xml:space="preserve"> PAGEREF _Toc236299310 \h </w:instrText>
             </w:r>
             <w:r>
               <w:rPr>
@@ -2434,7 +2546,7 @@
                 <w:noProof/>
                 <w:webHidden/>
               </w:rPr>
-              <w:t>10</w:t>
+              <w:t>11</w:t>
             </w:r>
             <w:r>
               <w:rPr>
@@ -2458,7 +2570,7 @@
               <w:lang w:val="fr-CA" w:eastAsia="fr-CA"/>
             </w:rPr>
           </w:pPr>
-          <w:hyperlink w:anchor="_Toc236297763" w:history="1">
+          <w:hyperlink w:anchor="_Toc236299311" w:history="1">
             <w:r>
               <w:rPr>
                 <w:rStyle w:val="Hyperlink"/>
@@ -2500,7 +2612,7 @@
                 <w:noProof/>
                 <w:webHidden/>
               </w:rPr>
-              <w:instrText xml:space="preserve"> PAGEREF _Toc236297763 \h </w:instrText>
+              <w:instrText xml:space="preserve"> PAGEREF _Toc236299311 \h </w:instrText>
             </w:r>
             <w:r>
               <w:rPr>
@@ -2520,7 +2632,7 @@
                 <w:noProof/>
                 <w:webHidden/>
               </w:rPr>
-              <w:t>10</w:t>
+              <w:t>11</w:t>
             </w:r>
             <w:r>
               <w:rPr>
@@ -2543,7 +2655,7 @@
               <w:lang w:val="fr-CA" w:eastAsia="fr-CA"/>
             </w:rPr>
           </w:pPr>
-          <w:hyperlink w:anchor="_Toc236297764" w:history="1">
+          <w:hyperlink w:anchor="_Toc236299312" w:history="1">
             <w:r>
               <w:rPr>
                 <w:rStyle w:val="Hyperlink"/>
@@ -2585,7 +2697,7 @@
                 <w:noProof/>
                 <w:webHidden/>
               </w:rPr>
-              <w:instrText xml:space="preserve"> PAGEREF _Toc236297764 \h </w:instrText>
+              <w:instrText xml:space="preserve"> PAGEREF _Toc236299312 \h </w:instrText>
             </w:r>
             <w:r>
               <w:rPr>
@@ -2605,7 +2717,7 @@
                 <w:noProof/>
                 <w:webHidden/>
               </w:rPr>
-              <w:t>11</w:t>
+              <w:t>12</w:t>
             </w:r>
             <w:r>
               <w:rPr>
@@ -2628,7 +2740,7 @@
               <w:lang w:val="fr-CA" w:eastAsia="fr-CA"/>
             </w:rPr>
           </w:pPr>
-          <w:hyperlink w:anchor="_Toc236297765" w:history="1">
+          <w:hyperlink w:anchor="_Toc236299313" w:history="1">
             <w:r>
               <w:rPr>
                 <w:rStyle w:val="Hyperlink"/>
@@ -2670,7 +2782,7 @@
                 <w:noProof/>
                 <w:webHidden/>
               </w:rPr>
-              <w:instrText xml:space="preserve"> PAGEREF _Toc236297765 \h </w:instrText>
+              <w:instrText xml:space="preserve"> PAGEREF _Toc236299313 \h </w:instrText>
             </w:r>
             <w:r>
               <w:rPr>
@@ -2690,7 +2802,7 @@
                 <w:noProof/>
                 <w:webHidden/>
               </w:rPr>
-              <w:t>12</w:t>
+              <w:t>13</w:t>
             </w:r>
             <w:r>
               <w:rPr>
@@ -2735,7 +2847,7 @@
           <w:numId w:val="0"/>
         </w:numPr>
       </w:pPr>
-      <w:bookmarkStart w:id="2" w:name="_Toc236297738"/>
+      <w:bookmarkStart w:id="2" w:name="_Toc236299286"/>
       <w:r>
         <w:lastRenderedPageBreak/>
         <w:t>List of Figures</w:t>
@@ -2783,7 +2895,7 @@
       <w:pPr>
         <w:pStyle w:val="Heading1"/>
       </w:pPr>
-      <w:bookmarkStart w:id="3" w:name="_Toc236297739"/>
+      <w:bookmarkStart w:id="3" w:name="_Toc236299287"/>
       <w:r>
         <w:lastRenderedPageBreak/>
         <w:t>Introduction</w:t>
@@ -2794,7 +2906,7 @@
       <w:pPr>
         <w:pStyle w:val="Heading2"/>
       </w:pPr>
-      <w:bookmarkStart w:id="4" w:name="_Toc236297740"/>
+      <w:bookmarkStart w:id="4" w:name="_Toc236299288"/>
       <w:r>
         <w:t>Research Background</w:t>
       </w:r>
@@ -2809,7 +2921,7 @@
       <w:pPr>
         <w:pStyle w:val="Heading2"/>
       </w:pPr>
-      <w:bookmarkStart w:id="5" w:name="_Toc236297741"/>
+      <w:bookmarkStart w:id="5" w:name="_Toc236299289"/>
       <w:r>
         <w:t>Problem Definition</w:t>
       </w:r>
@@ -2824,7 +2936,7 @@
       <w:pPr>
         <w:pStyle w:val="Heading2"/>
       </w:pPr>
-      <w:bookmarkStart w:id="6" w:name="_Toc236297742"/>
+      <w:bookmarkStart w:id="6" w:name="_Toc236299290"/>
       <w:r>
         <w:t>Objectives</w:t>
       </w:r>
@@ -2839,7 +2951,7 @@
       <w:pPr>
         <w:pStyle w:val="Heading2"/>
       </w:pPr>
-      <w:bookmarkStart w:id="7" w:name="_Toc236297743"/>
+      <w:bookmarkStart w:id="7" w:name="_Toc236299291"/>
       <w:r>
         <w:t>Research Philosophy</w:t>
       </w:r>
@@ -2859,7 +2971,7 @@
       <w:pPr>
         <w:pStyle w:val="Heading1"/>
       </w:pPr>
-      <w:bookmarkStart w:id="8" w:name="_Toc236297744"/>
+      <w:bookmarkStart w:id="8" w:name="_Toc236299292"/>
       <w:r>
         <w:lastRenderedPageBreak/>
         <w:t>Literature Review</w:t>
@@ -2870,7 +2982,7 @@
       <w:pPr>
         <w:pStyle w:val="Heading2"/>
       </w:pPr>
-      <w:bookmarkStart w:id="9" w:name="_Toc236297745"/>
+      <w:bookmarkStart w:id="9" w:name="_Toc236299293"/>
       <w:r>
         <w:t>Introduction to XYZ</w:t>
       </w:r>
@@ -2885,7 +2997,7 @@
       <w:pPr>
         <w:pStyle w:val="Heading2"/>
       </w:pPr>
-      <w:bookmarkStart w:id="10" w:name="_Toc236297746"/>
+      <w:bookmarkStart w:id="10" w:name="_Toc236299294"/>
       <w:r>
         <w:t>Aspect #1</w:t>
       </w:r>
@@ -2900,7 +3012,7 @@
       <w:pPr>
         <w:pStyle w:val="Heading2"/>
       </w:pPr>
-      <w:bookmarkStart w:id="11" w:name="_Toc236297747"/>
+      <w:bookmarkStart w:id="11" w:name="_Toc236299295"/>
       <w:r>
         <w:t>Aspect #</w:t>
       </w:r>
@@ -2918,7 +3030,7 @@
       <w:pPr>
         <w:pStyle w:val="Heading3"/>
       </w:pPr>
-      <w:bookmarkStart w:id="12" w:name="_Toc236297748"/>
+      <w:bookmarkStart w:id="12" w:name="_Toc236299296"/>
       <w:r>
         <w:t>Sub-Aspect 2.1</w:t>
       </w:r>
@@ -2938,7 +3050,7 @@
       <w:pPr>
         <w:pStyle w:val="Heading1"/>
       </w:pPr>
-      <w:bookmarkStart w:id="13" w:name="_Toc236297749"/>
+      <w:bookmarkStart w:id="13" w:name="_Toc236299297"/>
       <w:r>
         <w:lastRenderedPageBreak/>
         <w:t>Methodology: Research Design</w:t>
@@ -2949,7 +3061,7 @@
       <w:pPr>
         <w:pStyle w:val="Heading2"/>
       </w:pPr>
-      <w:bookmarkStart w:id="14" w:name="_Toc236297750"/>
+      <w:bookmarkStart w:id="14" w:name="_Toc236299298"/>
       <w:r>
         <w:t>Primary Research Methodology</w:t>
       </w:r>
@@ -2964,7 +3076,7 @@
       <w:pPr>
         <w:pStyle w:val="Heading2"/>
       </w:pPr>
-      <w:bookmarkStart w:id="15" w:name="_Toc236297751"/>
+      <w:bookmarkStart w:id="15" w:name="_Toc236299299"/>
       <w:r>
         <w:t>Secondary Research Methodology</w:t>
       </w:r>
@@ -2979,7 +3091,7 @@
       <w:pPr>
         <w:pStyle w:val="Heading2"/>
       </w:pPr>
-      <w:bookmarkStart w:id="16" w:name="_Toc236297752"/>
+      <w:bookmarkStart w:id="16" w:name="_Toc236299300"/>
       <w:r>
         <w:t>Limitations</w:t>
       </w:r>
@@ -2994,7 +3106,7 @@
       <w:pPr>
         <w:pStyle w:val="Heading2"/>
       </w:pPr>
-      <w:bookmarkStart w:id="17" w:name="_Toc236297753"/>
+      <w:bookmarkStart w:id="17" w:name="_Toc236299301"/>
       <w:r>
         <w:t>The Analysis Methods</w:t>
       </w:r>
@@ -3009,7 +3121,7 @@
       <w:pPr>
         <w:pStyle w:val="Heading2"/>
       </w:pPr>
-      <w:bookmarkStart w:id="18" w:name="_Toc236297754"/>
+      <w:bookmarkStart w:id="18" w:name="_Toc236299302"/>
       <w:r>
         <w:t>Response Rate</w:t>
       </w:r>
@@ -3029,7 +3141,7 @@
       <w:pPr>
         <w:pStyle w:val="Heading1"/>
       </w:pPr>
-      <w:bookmarkStart w:id="19" w:name="_Toc236297755"/>
+      <w:bookmarkStart w:id="19" w:name="_Toc236299303"/>
       <w:r>
         <w:lastRenderedPageBreak/>
         <w:t>Empirical Findings</w:t>
@@ -3040,7 +3152,7 @@
       <w:pPr>
         <w:pStyle w:val="Heading2"/>
       </w:pPr>
-      <w:bookmarkStart w:id="20" w:name="_Toc236297756"/>
+      <w:bookmarkStart w:id="20" w:name="_Toc236299304"/>
       <w:r>
         <w:t>Questionnaire Findings Regarding XYZ</w:t>
       </w:r>
@@ -3058,7 +3170,7 @@
       <w:pPr>
         <w:pStyle w:val="Heading2"/>
       </w:pPr>
-      <w:bookmarkStart w:id="21" w:name="_Toc236297757"/>
+      <w:bookmarkStart w:id="21" w:name="_Toc236299305"/>
       <w:r>
         <w:t xml:space="preserve">Questionnaire Findings Regarding </w:t>
       </w:r>
@@ -3079,7 +3191,7 @@
       <w:pPr>
         <w:pStyle w:val="Heading2"/>
       </w:pPr>
-      <w:bookmarkStart w:id="22" w:name="_Toc236297758"/>
+      <w:bookmarkStart w:id="22" w:name="_Toc236299306"/>
       <w:r>
         <w:t>Other Findings</w:t>
       </w:r>
@@ -3099,7 +3211,7 @@
       <w:pPr>
         <w:pStyle w:val="Heading1"/>
       </w:pPr>
-      <w:bookmarkStart w:id="23" w:name="_Toc236297759"/>
+      <w:bookmarkStart w:id="23" w:name="_Toc236299307"/>
       <w:r>
         <w:lastRenderedPageBreak/>
         <w:t>Conclusions and Recommendations</w:t>
@@ -3110,7 +3222,7 @@
       <w:pPr>
         <w:pStyle w:val="Heading2"/>
       </w:pPr>
-      <w:bookmarkStart w:id="24" w:name="_Toc236297760"/>
+      <w:bookmarkStart w:id="24" w:name="_Toc236299308"/>
       <w:r>
         <w:t>Conclusions</w:t>
       </w:r>
@@ -3125,7 +3237,7 @@
       <w:pPr>
         <w:pStyle w:val="Heading2"/>
       </w:pPr>
-      <w:bookmarkStart w:id="25" w:name="_Toc236297761"/>
+      <w:bookmarkStart w:id="25" w:name="_Toc236299309"/>
       <w:r>
         <w:t>Recommendations</w:t>
       </w:r>
@@ -3140,7 +3252,7 @@
       <w:pPr>
         <w:pStyle w:val="Heading2"/>
       </w:pPr>
-      <w:bookmarkStart w:id="26" w:name="_Toc236297762"/>
+      <w:bookmarkStart w:id="26" w:name="_Toc236299310"/>
       <w:r>
         <w:t>Reflection on the Dissertation Process</w:t>
       </w:r>
@@ -3155,7 +3267,7 @@
       <w:pPr>
         <w:pStyle w:val="Heading2"/>
       </w:pPr>
-      <w:bookmarkStart w:id="27" w:name="_Toc236297763"/>
+      <w:bookmarkStart w:id="27" w:name="_Toc236299311"/>
       <w:r>
         <w:t>Areas for Further Research</w:t>
       </w:r>
@@ -3167,42 +3279,11 @@
       </w:r>
     </w:p>
     <w:p>
-      <w:sdt>
-        <w:sdtPr>
-          <w:id w:val="1311826939"/>
-          <w:citation/>
-        </w:sdtPr>
-        <w:sdtContent>
-          <w:r>
-            <w:fldChar w:fldCharType="begin"/>
-          </w:r>
-          <w:r>
-            <w:instrText xml:space="preserve"> CITATION Bit26 \l 4105 </w:instrText>
-          </w:r>
-          <w:r>
-            <w:fldChar w:fldCharType="separate"/>
-          </w:r>
-          <w:r>
-            <w:rPr>
-              <w:noProof/>
-            </w:rPr>
-            <w:t>(Bittner, 2026)</w:t>
-          </w:r>
-          <w:r>
-            <w:fldChar w:fldCharType="end"/>
-          </w:r>
-        </w:sdtContent>
-      </w:sdt>
-      <w:r>
-        <w:t xml:space="preserve"> This is a quote from Bittner, 2026</w:t>
-      </w:r>
-    </w:p>
-    <w:p>
       <w:r>
         <w:br w:type="page"/>
       </w:r>
     </w:p>
-    <w:bookmarkStart w:id="28" w:name="_Toc236297765" w:displacedByCustomXml="next"/>
+    <w:bookmarkStart w:id="28" w:name="_Toc236299312" w:displacedByCustomXml="next"/>
     <w:sdt>
       <w:sdtPr>
         <w:id w:val="-1908527386"/>
@@ -3227,6 +3308,7 @@
           <w:r>
             <w:t>Bibliography</w:t>
           </w:r>
+          <w:bookmarkEnd w:id="28"/>
         </w:p>
         <w:sdt>
           <w:sdtPr>
@@ -3235,14 +3317,6 @@
           </w:sdtPr>
           <w:sdtContent>
             <w:p>
-              <w:pPr>
-                <w:pStyle w:val="Bibliography"/>
-                <w:rPr>
-                  <w:noProof/>
-                  <w:kern w:val="0"/>
-                  <w14:ligatures w14:val="none"/>
-                </w:rPr>
-              </w:pPr>
               <w:r>
                 <w:fldChar w:fldCharType="begin"/>
               </w:r>
@@ -3254,26 +3328,13 @@
               </w:r>
               <w:r>
                 <w:rPr>
+                  <w:b/>
+                  <w:bCs/>
                   <w:noProof/>
+                  <w:lang w:val="en-US"/>
                 </w:rPr>
-                <w:t xml:space="preserve">Bittner, M., 2026. </w:t>
+                <w:t>There are no sources in the current document.</w:t>
               </w:r>
-              <w:r>
-                <w:rPr>
-                  <w:i/>
-                  <w:iCs/>
-                  <w:noProof/>
-                </w:rPr>
-                <w:t xml:space="preserve">How managers should manage change. </w:t>
-              </w:r>
-              <w:r>
-                <w:rPr>
-                  <w:noProof/>
-                </w:rPr>
-                <w:t>2nd ed. Quebec: Works Press.</w:t>
-              </w:r>
-            </w:p>
-            <w:p>
               <w:r>
                 <w:rPr>
                   <w:b/>
@@ -3304,11 +3365,12 @@
       <w:pPr>
         <w:pStyle w:val="Heading1"/>
       </w:pPr>
+      <w:bookmarkStart w:id="29" w:name="_Toc236299313"/>
       <w:r>
         <w:lastRenderedPageBreak/>
         <w:t>Appendices</w:t>
       </w:r>
-      <w:bookmarkEnd w:id="28"/>
+      <w:bookmarkEnd w:id="29"/>
     </w:p>
     <w:sectPr>
       <w:headerReference w:type="even" r:id="rId9"/>
@@ -4560,7 +4622,6 @@
   <w:style w:type="character" w:default="1" w:styleId="DefaultParagraphFont">
     <w:name w:val="Default Paragraph Font"/>
     <w:uiPriority w:val="1"/>
-    <w:semiHidden/>
     <w:unhideWhenUsed/>
   </w:style>
   <w:style w:type="table" w:default="1" w:styleId="TableNormal">
@@ -5333,33 +5394,11 @@
 </file>
 
 <file path=customXml/item1.xml><?xml version="1.0" encoding="utf-8"?>
-<b:Sources xmlns:b="http://schemas.openxmlformats.org/officeDocument/2006/bibliography" xmlns="http://schemas.openxmlformats.org/officeDocument/2006/bibliography" SelectedStyle="\HarvardAnglia2008OfficeOnline.xsl" StyleName="Harvard - Anglia" Version="2008">
-  <b:Source>
-    <b:Tag>Bit26</b:Tag>
-    <b:SourceType>Book</b:SourceType>
-    <b:Guid>{05ED94E2-CC79-4B0D-A87D-5575CB3C9564}</b:Guid>
-    <b:Author>
-      <b:Author>
-        <b:NameList>
-          <b:Person>
-            <b:Last>Bittner</b:Last>
-            <b:First>Martin</b:First>
-          </b:Person>
-        </b:NameList>
-      </b:Author>
-    </b:Author>
-    <b:Title>How managers should manage change</b:Title>
-    <b:Year>2026</b:Year>
-    <b:City>Quebec</b:City>
-    <b:Publisher>Works Press</b:Publisher>
-    <b:Edition>2nd</b:Edition>
-    <b:RefOrder>1</b:RefOrder>
-  </b:Source>
-</b:Sources>
+<b:Sources xmlns:b="http://schemas.openxmlformats.org/officeDocument/2006/bibliography" xmlns="http://schemas.openxmlformats.org/officeDocument/2006/bibliography" SelectedStyle="\HarvardAnglia2008OfficeOnline.xsl" StyleName="Harvard - Anglia" Version="2008"/>
 </file>
 
 <file path=customXml/itemProps1.xml><?xml version="1.0" encoding="utf-8"?>
-<ds:datastoreItem xmlns:ds="http://schemas.openxmlformats.org/officeDocument/2006/customXml" ds:itemID="{7A31E8EF-9439-46D8-9E51-BF6421F3A1D6}">
+<ds:datastoreItem xmlns:ds="http://schemas.openxmlformats.org/officeDocument/2006/customXml" ds:itemID="{9AB2F975-95FE-4F99-8DEB-249F3D452748}">
   <ds:schemaRefs>
     <ds:schemaRef ds:uri="http://schemas.openxmlformats.org/officeDocument/2006/bibliography"/>
   </ds:schemaRefs>

</xml_diff>

<commit_message>
Update templates for Capstone Project and Proposal
</commit_message>
<xml_diff>
--- a/Capstone Project.docx
+++ b/Capstone Project.docx
@@ -239,7 +239,7 @@
           <w:numId w:val="0"/>
         </w:numPr>
       </w:pPr>
-      <w:bookmarkStart w:id="0" w:name="_Toc236299284"/>
+      <w:bookmarkStart w:id="0" w:name="_Toc236308617"/>
       <w:r>
         <w:lastRenderedPageBreak/>
         <w:t>Abstract</w:t>
@@ -256,9 +256,15 @@
         <w:br w:type="page"/>
       </w:r>
     </w:p>
-    <w:bookmarkStart w:id="1" w:name="_Toc236299285" w:displacedByCustomXml="next"/>
+    <w:bookmarkStart w:id="1" w:name="_Toc236308618" w:displacedByCustomXml="next"/>
     <w:sdt>
       <w:sdtPr>
+        <w:rPr>
+          <w:rFonts w:asciiTheme="minorHAnsi" w:eastAsiaTheme="minorHAnsi" w:hAnsiTheme="minorHAnsi" w:cstheme="minorBidi"/>
+          <w:color w:val="auto"/>
+          <w:sz w:val="24"/>
+          <w:szCs w:val="24"/>
+        </w:rPr>
         <w:id w:val="1472247903"/>
         <w:docPartObj>
           <w:docPartGallery w:val="Table of Contents"/>
@@ -267,11 +273,7 @@
       </w:sdtPr>
       <w:sdtEndPr>
         <w:rPr>
-          <w:rFonts w:asciiTheme="minorHAnsi" w:eastAsiaTheme="minorHAnsi" w:hAnsiTheme="minorHAnsi" w:cstheme="minorBidi"/>
           <w:noProof/>
-          <w:color w:val="auto"/>
-          <w:sz w:val="24"/>
-          <w:szCs w:val="24"/>
         </w:rPr>
       </w:sdtEndPr>
       <w:sdtContent>
@@ -306,7 +308,7 @@
           <w:r>
             <w:fldChar w:fldCharType="separate"/>
           </w:r>
-          <w:hyperlink w:anchor="_Toc236299284" w:history="1">
+          <w:hyperlink w:anchor="_Toc236308617" w:history="1">
             <w:r>
               <w:rPr>
                 <w:rStyle w:val="Hyperlink"/>
@@ -333,7 +335,7 @@
                 <w:noProof/>
                 <w:webHidden/>
               </w:rPr>
-              <w:instrText xml:space="preserve"> PAGEREF _Toc236299284 \h </w:instrText>
+              <w:instrText xml:space="preserve"> PAGEREF _Toc236308617 \h </w:instrText>
             </w:r>
             <w:r>
               <w:rPr>
@@ -373,7 +375,7 @@
               <w:lang w:val="fr-CA" w:eastAsia="fr-CA"/>
             </w:rPr>
           </w:pPr>
-          <w:hyperlink w:anchor="_Toc236299285" w:history="1">
+          <w:hyperlink w:anchor="_Toc236308618" w:history="1">
             <w:r>
               <w:rPr>
                 <w:rStyle w:val="Hyperlink"/>
@@ -400,7 +402,7 @@
                 <w:noProof/>
                 <w:webHidden/>
               </w:rPr>
-              <w:instrText xml:space="preserve"> PAGEREF _Toc236299285 \h </w:instrText>
+              <w:instrText xml:space="preserve"> PAGEREF _Toc236308618 \h </w:instrText>
             </w:r>
             <w:r>
               <w:rPr>
@@ -440,7 +442,7 @@
               <w:lang w:val="fr-CA" w:eastAsia="fr-CA"/>
             </w:rPr>
           </w:pPr>
-          <w:hyperlink w:anchor="_Toc236299286" w:history="1">
+          <w:hyperlink w:anchor="_Toc236308619" w:history="1">
             <w:r>
               <w:rPr>
                 <w:rStyle w:val="Hyperlink"/>
@@ -467,7 +469,7 @@
                 <w:noProof/>
                 <w:webHidden/>
               </w:rPr>
-              <w:instrText xml:space="preserve"> PAGEREF _Toc236299286 \h </w:instrText>
+              <w:instrText xml:space="preserve"> PAGEREF _Toc236308619 \h </w:instrText>
             </w:r>
             <w:r>
               <w:rPr>
@@ -510,7 +512,7 @@
               <w:lang w:val="fr-CA" w:eastAsia="fr-CA"/>
             </w:rPr>
           </w:pPr>
-          <w:hyperlink w:anchor="_Toc236299287" w:history="1">
+          <w:hyperlink w:anchor="_Toc236308620" w:history="1">
             <w:r>
               <w:rPr>
                 <w:rStyle w:val="Hyperlink"/>
@@ -552,7 +554,7 @@
                 <w:noProof/>
                 <w:webHidden/>
               </w:rPr>
-              <w:instrText xml:space="preserve"> PAGEREF _Toc236299287 \h </w:instrText>
+              <w:instrText xml:space="preserve"> PAGEREF _Toc236308620 \h </w:instrText>
             </w:r>
             <w:r>
               <w:rPr>
@@ -596,7 +598,7 @@
               <w:lang w:val="fr-CA" w:eastAsia="fr-CA"/>
             </w:rPr>
           </w:pPr>
-          <w:hyperlink w:anchor="_Toc236299288" w:history="1">
+          <w:hyperlink w:anchor="_Toc236308621" w:history="1">
             <w:r>
               <w:rPr>
                 <w:rStyle w:val="Hyperlink"/>
@@ -638,7 +640,7 @@
                 <w:noProof/>
                 <w:webHidden/>
               </w:rPr>
-              <w:instrText xml:space="preserve"> PAGEREF _Toc236299288 \h </w:instrText>
+              <w:instrText xml:space="preserve"> PAGEREF _Toc236308621 \h </w:instrText>
             </w:r>
             <w:r>
               <w:rPr>
@@ -682,7 +684,7 @@
               <w:lang w:val="fr-CA" w:eastAsia="fr-CA"/>
             </w:rPr>
           </w:pPr>
-          <w:hyperlink w:anchor="_Toc236299289" w:history="1">
+          <w:hyperlink w:anchor="_Toc236308622" w:history="1">
             <w:r>
               <w:rPr>
                 <w:rStyle w:val="Hyperlink"/>
@@ -724,7 +726,7 @@
                 <w:noProof/>
                 <w:webHidden/>
               </w:rPr>
-              <w:instrText xml:space="preserve"> PAGEREF _Toc236299289 \h </w:instrText>
+              <w:instrText xml:space="preserve"> PAGEREF _Toc236308622 \h </w:instrText>
             </w:r>
             <w:r>
               <w:rPr>
@@ -768,7 +770,7 @@
               <w:lang w:val="fr-CA" w:eastAsia="fr-CA"/>
             </w:rPr>
           </w:pPr>
-          <w:hyperlink w:anchor="_Toc236299290" w:history="1">
+          <w:hyperlink w:anchor="_Toc236308623" w:history="1">
             <w:r>
               <w:rPr>
                 <w:rStyle w:val="Hyperlink"/>
@@ -810,7 +812,7 @@
                 <w:noProof/>
                 <w:webHidden/>
               </w:rPr>
-              <w:instrText xml:space="preserve"> PAGEREF _Toc236299290 \h </w:instrText>
+              <w:instrText xml:space="preserve"> PAGEREF _Toc236308623 \h </w:instrText>
             </w:r>
             <w:r>
               <w:rPr>
@@ -854,7 +856,7 @@
               <w:lang w:val="fr-CA" w:eastAsia="fr-CA"/>
             </w:rPr>
           </w:pPr>
-          <w:hyperlink w:anchor="_Toc236299291" w:history="1">
+          <w:hyperlink w:anchor="_Toc236308624" w:history="1">
             <w:r>
               <w:rPr>
                 <w:rStyle w:val="Hyperlink"/>
@@ -896,7 +898,7 @@
                 <w:noProof/>
                 <w:webHidden/>
               </w:rPr>
-              <w:instrText xml:space="preserve"> PAGEREF _Toc236299291 \h </w:instrText>
+              <w:instrText xml:space="preserve"> PAGEREF _Toc236308624 \h </w:instrText>
             </w:r>
             <w:r>
               <w:rPr>
@@ -939,7 +941,7 @@
               <w:lang w:val="fr-CA" w:eastAsia="fr-CA"/>
             </w:rPr>
           </w:pPr>
-          <w:hyperlink w:anchor="_Toc236299292" w:history="1">
+          <w:hyperlink w:anchor="_Toc236308625" w:history="1">
             <w:r>
               <w:rPr>
                 <w:rStyle w:val="Hyperlink"/>
@@ -981,7 +983,7 @@
                 <w:noProof/>
                 <w:webHidden/>
               </w:rPr>
-              <w:instrText xml:space="preserve"> PAGEREF _Toc236299292 \h </w:instrText>
+              <w:instrText xml:space="preserve"> PAGEREF _Toc236308625 \h </w:instrText>
             </w:r>
             <w:r>
               <w:rPr>
@@ -1025,7 +1027,7 @@
               <w:lang w:val="fr-CA" w:eastAsia="fr-CA"/>
             </w:rPr>
           </w:pPr>
-          <w:hyperlink w:anchor="_Toc236299293" w:history="1">
+          <w:hyperlink w:anchor="_Toc236308626" w:history="1">
             <w:r>
               <w:rPr>
                 <w:rStyle w:val="Hyperlink"/>
@@ -1067,7 +1069,7 @@
                 <w:noProof/>
                 <w:webHidden/>
               </w:rPr>
-              <w:instrText xml:space="preserve"> PAGEREF _Toc236299293 \h </w:instrText>
+              <w:instrText xml:space="preserve"> PAGEREF _Toc236308626 \h </w:instrText>
             </w:r>
             <w:r>
               <w:rPr>
@@ -1111,7 +1113,7 @@
               <w:lang w:val="fr-CA" w:eastAsia="fr-CA"/>
             </w:rPr>
           </w:pPr>
-          <w:hyperlink w:anchor="_Toc236299294" w:history="1">
+          <w:hyperlink w:anchor="_Toc236308627" w:history="1">
             <w:r>
               <w:rPr>
                 <w:rStyle w:val="Hyperlink"/>
@@ -1153,7 +1155,7 @@
                 <w:noProof/>
                 <w:webHidden/>
               </w:rPr>
-              <w:instrText xml:space="preserve"> PAGEREF _Toc236299294 \h </w:instrText>
+              <w:instrText xml:space="preserve"> PAGEREF _Toc236308627 \h </w:instrText>
             </w:r>
             <w:r>
               <w:rPr>
@@ -1197,7 +1199,7 @@
               <w:lang w:val="fr-CA" w:eastAsia="fr-CA"/>
             </w:rPr>
           </w:pPr>
-          <w:hyperlink w:anchor="_Toc236299295" w:history="1">
+          <w:hyperlink w:anchor="_Toc236308628" w:history="1">
             <w:r>
               <w:rPr>
                 <w:rStyle w:val="Hyperlink"/>
@@ -1239,7 +1241,7 @@
                 <w:noProof/>
                 <w:webHidden/>
               </w:rPr>
-              <w:instrText xml:space="preserve"> PAGEREF _Toc236299295 \h </w:instrText>
+              <w:instrText xml:space="preserve"> PAGEREF _Toc236308628 \h </w:instrText>
             </w:r>
             <w:r>
               <w:rPr>
@@ -1283,7 +1285,7 @@
               <w:lang w:val="fr-CA" w:eastAsia="fr-CA"/>
             </w:rPr>
           </w:pPr>
-          <w:hyperlink w:anchor="_Toc236299296" w:history="1">
+          <w:hyperlink w:anchor="_Toc236308629" w:history="1">
             <w:r>
               <w:rPr>
                 <w:rStyle w:val="Hyperlink"/>
@@ -1325,7 +1327,7 @@
                 <w:noProof/>
                 <w:webHidden/>
               </w:rPr>
-              <w:instrText xml:space="preserve"> PAGEREF _Toc236299296 \h </w:instrText>
+              <w:instrText xml:space="preserve"> PAGEREF _Toc236308629 \h </w:instrText>
             </w:r>
             <w:r>
               <w:rPr>
@@ -1368,7 +1370,7 @@
               <w:lang w:val="fr-CA" w:eastAsia="fr-CA"/>
             </w:rPr>
           </w:pPr>
-          <w:hyperlink w:anchor="_Toc236299297" w:history="1">
+          <w:hyperlink w:anchor="_Toc236308630" w:history="1">
             <w:r>
               <w:rPr>
                 <w:rStyle w:val="Hyperlink"/>
@@ -1410,7 +1412,7 @@
                 <w:noProof/>
                 <w:webHidden/>
               </w:rPr>
-              <w:instrText xml:space="preserve"> PAGEREF _Toc236299297 \h </w:instrText>
+              <w:instrText xml:space="preserve"> PAGEREF _Toc236308630 \h </w:instrText>
             </w:r>
             <w:r>
               <w:rPr>
@@ -1454,7 +1456,7 @@
               <w:lang w:val="fr-CA" w:eastAsia="fr-CA"/>
             </w:rPr>
           </w:pPr>
-          <w:hyperlink w:anchor="_Toc236299298" w:history="1">
+          <w:hyperlink w:anchor="_Toc236308631" w:history="1">
             <w:r>
               <w:rPr>
                 <w:rStyle w:val="Hyperlink"/>
@@ -1496,7 +1498,7 @@
                 <w:noProof/>
                 <w:webHidden/>
               </w:rPr>
-              <w:instrText xml:space="preserve"> PAGEREF _Toc236299298 \h </w:instrText>
+              <w:instrText xml:space="preserve"> PAGEREF _Toc236308631 \h </w:instrText>
             </w:r>
             <w:r>
               <w:rPr>
@@ -1540,7 +1542,7 @@
               <w:lang w:val="fr-CA" w:eastAsia="fr-CA"/>
             </w:rPr>
           </w:pPr>
-          <w:hyperlink w:anchor="_Toc236299299" w:history="1">
+          <w:hyperlink w:anchor="_Toc236308632" w:history="1">
             <w:r>
               <w:rPr>
                 <w:rStyle w:val="Hyperlink"/>
@@ -1582,7 +1584,7 @@
                 <w:noProof/>
                 <w:webHidden/>
               </w:rPr>
-              <w:instrText xml:space="preserve"> PAGEREF _Toc236299299 \h </w:instrText>
+              <w:instrText xml:space="preserve"> PAGEREF _Toc236308632 \h </w:instrText>
             </w:r>
             <w:r>
               <w:rPr>
@@ -1626,7 +1628,7 @@
               <w:lang w:val="fr-CA" w:eastAsia="fr-CA"/>
             </w:rPr>
           </w:pPr>
-          <w:hyperlink w:anchor="_Toc236299300" w:history="1">
+          <w:hyperlink w:anchor="_Toc236308633" w:history="1">
             <w:r>
               <w:rPr>
                 <w:rStyle w:val="Hyperlink"/>
@@ -1668,7 +1670,7 @@
                 <w:noProof/>
                 <w:webHidden/>
               </w:rPr>
-              <w:instrText xml:space="preserve"> PAGEREF _Toc236299300 \h </w:instrText>
+              <w:instrText xml:space="preserve"> PAGEREF _Toc236308633 \h </w:instrText>
             </w:r>
             <w:r>
               <w:rPr>
@@ -1712,7 +1714,7 @@
               <w:lang w:val="fr-CA" w:eastAsia="fr-CA"/>
             </w:rPr>
           </w:pPr>
-          <w:hyperlink w:anchor="_Toc236299301" w:history="1">
+          <w:hyperlink w:anchor="_Toc236308634" w:history="1">
             <w:r>
               <w:rPr>
                 <w:rStyle w:val="Hyperlink"/>
@@ -1754,7 +1756,7 @@
                 <w:noProof/>
                 <w:webHidden/>
               </w:rPr>
-              <w:instrText xml:space="preserve"> PAGEREF _Toc236299301 \h </w:instrText>
+              <w:instrText xml:space="preserve"> PAGEREF _Toc236308634 \h </w:instrText>
             </w:r>
             <w:r>
               <w:rPr>
@@ -1798,7 +1800,7 @@
               <w:lang w:val="fr-CA" w:eastAsia="fr-CA"/>
             </w:rPr>
           </w:pPr>
-          <w:hyperlink w:anchor="_Toc236299302" w:history="1">
+          <w:hyperlink w:anchor="_Toc236308635" w:history="1">
             <w:r>
               <w:rPr>
                 <w:rStyle w:val="Hyperlink"/>
@@ -1840,7 +1842,7 @@
                 <w:noProof/>
                 <w:webHidden/>
               </w:rPr>
-              <w:instrText xml:space="preserve"> PAGEREF _Toc236299302 \h </w:instrText>
+              <w:instrText xml:space="preserve"> PAGEREF _Toc236308635 \h </w:instrText>
             </w:r>
             <w:r>
               <w:rPr>
@@ -1883,7 +1885,7 @@
               <w:lang w:val="fr-CA" w:eastAsia="fr-CA"/>
             </w:rPr>
           </w:pPr>
-          <w:hyperlink w:anchor="_Toc236299303" w:history="1">
+          <w:hyperlink w:anchor="_Toc236308636" w:history="1">
             <w:r>
               <w:rPr>
                 <w:rStyle w:val="Hyperlink"/>
@@ -1925,7 +1927,7 @@
                 <w:noProof/>
                 <w:webHidden/>
               </w:rPr>
-              <w:instrText xml:space="preserve"> PAGEREF _Toc236299303 \h </w:instrText>
+              <w:instrText xml:space="preserve"> PAGEREF _Toc236308636 \h </w:instrText>
             </w:r>
             <w:r>
               <w:rPr>
@@ -1969,7 +1971,7 @@
               <w:lang w:val="fr-CA" w:eastAsia="fr-CA"/>
             </w:rPr>
           </w:pPr>
-          <w:hyperlink w:anchor="_Toc236299304" w:history="1">
+          <w:hyperlink w:anchor="_Toc236308637" w:history="1">
             <w:r>
               <w:rPr>
                 <w:rStyle w:val="Hyperlink"/>
@@ -2011,7 +2013,7 @@
                 <w:noProof/>
                 <w:webHidden/>
               </w:rPr>
-              <w:instrText xml:space="preserve"> PAGEREF _Toc236299304 \h </w:instrText>
+              <w:instrText xml:space="preserve"> PAGEREF _Toc236308637 \h </w:instrText>
             </w:r>
             <w:r>
               <w:rPr>
@@ -2055,7 +2057,7 @@
               <w:lang w:val="fr-CA" w:eastAsia="fr-CA"/>
             </w:rPr>
           </w:pPr>
-          <w:hyperlink w:anchor="_Toc236299305" w:history="1">
+          <w:hyperlink w:anchor="_Toc236308638" w:history="1">
             <w:r>
               <w:rPr>
                 <w:rStyle w:val="Hyperlink"/>
@@ -2097,7 +2099,7 @@
                 <w:noProof/>
                 <w:webHidden/>
               </w:rPr>
-              <w:instrText xml:space="preserve"> PAGEREF _Toc236299305 \h </w:instrText>
+              <w:instrText xml:space="preserve"> PAGEREF _Toc236308638 \h </w:instrText>
             </w:r>
             <w:r>
               <w:rPr>
@@ -2141,7 +2143,7 @@
               <w:lang w:val="fr-CA" w:eastAsia="fr-CA"/>
             </w:rPr>
           </w:pPr>
-          <w:hyperlink w:anchor="_Toc236299306" w:history="1">
+          <w:hyperlink w:anchor="_Toc236308639" w:history="1">
             <w:r>
               <w:rPr>
                 <w:rStyle w:val="Hyperlink"/>
@@ -2183,7 +2185,7 @@
                 <w:noProof/>
                 <w:webHidden/>
               </w:rPr>
-              <w:instrText xml:space="preserve"> PAGEREF _Toc236299306 \h </w:instrText>
+              <w:instrText xml:space="preserve"> PAGEREF _Toc236308639 \h </w:instrText>
             </w:r>
             <w:r>
               <w:rPr>
@@ -2226,7 +2228,7 @@
               <w:lang w:val="fr-CA" w:eastAsia="fr-CA"/>
             </w:rPr>
           </w:pPr>
-          <w:hyperlink w:anchor="_Toc236299307" w:history="1">
+          <w:hyperlink w:anchor="_Toc236308640" w:history="1">
             <w:r>
               <w:rPr>
                 <w:rStyle w:val="Hyperlink"/>
@@ -2268,7 +2270,7 @@
                 <w:noProof/>
                 <w:webHidden/>
               </w:rPr>
-              <w:instrText xml:space="preserve"> PAGEREF _Toc236299307 \h </w:instrText>
+              <w:instrText xml:space="preserve"> PAGEREF _Toc236308640 \h </w:instrText>
             </w:r>
             <w:r>
               <w:rPr>
@@ -2312,7 +2314,7 @@
               <w:lang w:val="fr-CA" w:eastAsia="fr-CA"/>
             </w:rPr>
           </w:pPr>
-          <w:hyperlink w:anchor="_Toc236299308" w:history="1">
+          <w:hyperlink w:anchor="_Toc236308641" w:history="1">
             <w:r>
               <w:rPr>
                 <w:rStyle w:val="Hyperlink"/>
@@ -2354,7 +2356,7 @@
                 <w:noProof/>
                 <w:webHidden/>
               </w:rPr>
-              <w:instrText xml:space="preserve"> PAGEREF _Toc236299308 \h </w:instrText>
+              <w:instrText xml:space="preserve"> PAGEREF _Toc236308641 \h </w:instrText>
             </w:r>
             <w:r>
               <w:rPr>
@@ -2398,7 +2400,7 @@
               <w:lang w:val="fr-CA" w:eastAsia="fr-CA"/>
             </w:rPr>
           </w:pPr>
-          <w:hyperlink w:anchor="_Toc236299309" w:history="1">
+          <w:hyperlink w:anchor="_Toc236308642" w:history="1">
             <w:r>
               <w:rPr>
                 <w:rStyle w:val="Hyperlink"/>
@@ -2440,7 +2442,7 @@
                 <w:noProof/>
                 <w:webHidden/>
               </w:rPr>
-              <w:instrText xml:space="preserve"> PAGEREF _Toc236299309 \h </w:instrText>
+              <w:instrText xml:space="preserve"> PAGEREF _Toc236308642 \h </w:instrText>
             </w:r>
             <w:r>
               <w:rPr>
@@ -2484,7 +2486,7 @@
               <w:lang w:val="fr-CA" w:eastAsia="fr-CA"/>
             </w:rPr>
           </w:pPr>
-          <w:hyperlink w:anchor="_Toc236299310" w:history="1">
+          <w:hyperlink w:anchor="_Toc236308643" w:history="1">
             <w:r>
               <w:rPr>
                 <w:rStyle w:val="Hyperlink"/>
@@ -2526,7 +2528,7 @@
                 <w:noProof/>
                 <w:webHidden/>
               </w:rPr>
-              <w:instrText xml:space="preserve"> PAGEREF _Toc236299310 \h </w:instrText>
+              <w:instrText xml:space="preserve"> PAGEREF _Toc236308643 \h </w:instrText>
             </w:r>
             <w:r>
               <w:rPr>
@@ -2570,7 +2572,7 @@
               <w:lang w:val="fr-CA" w:eastAsia="fr-CA"/>
             </w:rPr>
           </w:pPr>
-          <w:hyperlink w:anchor="_Toc236299311" w:history="1">
+          <w:hyperlink w:anchor="_Toc236308644" w:history="1">
             <w:r>
               <w:rPr>
                 <w:rStyle w:val="Hyperlink"/>
@@ -2612,7 +2614,7 @@
                 <w:noProof/>
                 <w:webHidden/>
               </w:rPr>
-              <w:instrText xml:space="preserve"> PAGEREF _Toc236299311 \h </w:instrText>
+              <w:instrText xml:space="preserve"> PAGEREF _Toc236308644 \h </w:instrText>
             </w:r>
             <w:r>
               <w:rPr>
@@ -2646,31 +2648,13 @@
         <w:p>
           <w:pPr>
             <w:pStyle w:val="TOC1"/>
-            <w:tabs>
-              <w:tab w:val="left" w:pos="480"/>
-            </w:tabs>
             <w:rPr>
               <w:rFonts w:eastAsiaTheme="minorEastAsia"/>
               <w:noProof/>
               <w:lang w:val="fr-CA" w:eastAsia="fr-CA"/>
             </w:rPr>
           </w:pPr>
-          <w:hyperlink w:anchor="_Toc236299312" w:history="1">
-            <w:r>
-              <w:rPr>
-                <w:rStyle w:val="Hyperlink"/>
-                <w:noProof/>
-              </w:rPr>
-              <w:t>6</w:t>
-            </w:r>
-            <w:r>
-              <w:rPr>
-                <w:rFonts w:eastAsiaTheme="minorEastAsia"/>
-                <w:noProof/>
-                <w:lang w:val="fr-CA" w:eastAsia="fr-CA"/>
-              </w:rPr>
-              <w:tab/>
-            </w:r>
+          <w:hyperlink w:anchor="_Toc236308645" w:history="1">
             <w:r>
               <w:rPr>
                 <w:rStyle w:val="Hyperlink"/>
@@ -2697,7 +2681,7 @@
                 <w:noProof/>
                 <w:webHidden/>
               </w:rPr>
-              <w:instrText xml:space="preserve"> PAGEREF _Toc236299312 \h </w:instrText>
+              <w:instrText xml:space="preserve"> PAGEREF _Toc236308645 \h </w:instrText>
             </w:r>
             <w:r>
               <w:rPr>
@@ -2731,31 +2715,13 @@
         <w:p>
           <w:pPr>
             <w:pStyle w:val="TOC1"/>
-            <w:tabs>
-              <w:tab w:val="left" w:pos="480"/>
-            </w:tabs>
             <w:rPr>
               <w:rFonts w:eastAsiaTheme="minorEastAsia"/>
               <w:noProof/>
               <w:lang w:val="fr-CA" w:eastAsia="fr-CA"/>
             </w:rPr>
           </w:pPr>
-          <w:hyperlink w:anchor="_Toc236299313" w:history="1">
-            <w:r>
-              <w:rPr>
-                <w:rStyle w:val="Hyperlink"/>
-                <w:noProof/>
-              </w:rPr>
-              <w:t>7</w:t>
-            </w:r>
-            <w:r>
-              <w:rPr>
-                <w:rFonts w:eastAsiaTheme="minorEastAsia"/>
-                <w:noProof/>
-                <w:lang w:val="fr-CA" w:eastAsia="fr-CA"/>
-              </w:rPr>
-              <w:tab/>
-            </w:r>
+          <w:hyperlink w:anchor="_Toc236308646" w:history="1">
             <w:r>
               <w:rPr>
                 <w:rStyle w:val="Hyperlink"/>
@@ -2782,7 +2748,7 @@
                 <w:noProof/>
                 <w:webHidden/>
               </w:rPr>
-              <w:instrText xml:space="preserve"> PAGEREF _Toc236299313 \h </w:instrText>
+              <w:instrText xml:space="preserve"> PAGEREF _Toc236308646 \h </w:instrText>
             </w:r>
             <w:r>
               <w:rPr>
@@ -2847,7 +2813,7 @@
           <w:numId w:val="0"/>
         </w:numPr>
       </w:pPr>
-      <w:bookmarkStart w:id="2" w:name="_Toc236299286"/>
+      <w:bookmarkStart w:id="2" w:name="_Toc236308619"/>
       <w:r>
         <w:lastRenderedPageBreak/>
         <w:t>List of Figures</w:t>
@@ -2895,7 +2861,7 @@
       <w:pPr>
         <w:pStyle w:val="Heading1"/>
       </w:pPr>
-      <w:bookmarkStart w:id="3" w:name="_Toc236299287"/>
+      <w:bookmarkStart w:id="3" w:name="_Toc236308620"/>
       <w:r>
         <w:lastRenderedPageBreak/>
         <w:t>Introduction</w:t>
@@ -2906,7 +2872,7 @@
       <w:pPr>
         <w:pStyle w:val="Heading2"/>
       </w:pPr>
-      <w:bookmarkStart w:id="4" w:name="_Toc236299288"/>
+      <w:bookmarkStart w:id="4" w:name="_Toc236308621"/>
       <w:r>
         <w:t>Research Background</w:t>
       </w:r>
@@ -2921,7 +2887,7 @@
       <w:pPr>
         <w:pStyle w:val="Heading2"/>
       </w:pPr>
-      <w:bookmarkStart w:id="5" w:name="_Toc236299289"/>
+      <w:bookmarkStart w:id="5" w:name="_Toc236308622"/>
       <w:r>
         <w:t>Problem Definition</w:t>
       </w:r>
@@ -2936,7 +2902,7 @@
       <w:pPr>
         <w:pStyle w:val="Heading2"/>
       </w:pPr>
-      <w:bookmarkStart w:id="6" w:name="_Toc236299290"/>
+      <w:bookmarkStart w:id="6" w:name="_Toc236308623"/>
       <w:r>
         <w:t>Objectives</w:t>
       </w:r>
@@ -2951,7 +2917,7 @@
       <w:pPr>
         <w:pStyle w:val="Heading2"/>
       </w:pPr>
-      <w:bookmarkStart w:id="7" w:name="_Toc236299291"/>
+      <w:bookmarkStart w:id="7" w:name="_Toc236308624"/>
       <w:r>
         <w:t>Research Philosophy</w:t>
       </w:r>
@@ -2971,7 +2937,7 @@
       <w:pPr>
         <w:pStyle w:val="Heading1"/>
       </w:pPr>
-      <w:bookmarkStart w:id="8" w:name="_Toc236299292"/>
+      <w:bookmarkStart w:id="8" w:name="_Toc236308625"/>
       <w:r>
         <w:lastRenderedPageBreak/>
         <w:t>Literature Review</w:t>
@@ -2982,7 +2948,7 @@
       <w:pPr>
         <w:pStyle w:val="Heading2"/>
       </w:pPr>
-      <w:bookmarkStart w:id="9" w:name="_Toc236299293"/>
+      <w:bookmarkStart w:id="9" w:name="_Toc236308626"/>
       <w:r>
         <w:t>Introduction to XYZ</w:t>
       </w:r>
@@ -2997,7 +2963,7 @@
       <w:pPr>
         <w:pStyle w:val="Heading2"/>
       </w:pPr>
-      <w:bookmarkStart w:id="10" w:name="_Toc236299294"/>
+      <w:bookmarkStart w:id="10" w:name="_Toc236308627"/>
       <w:r>
         <w:t>Aspect #1</w:t>
       </w:r>
@@ -3012,12 +2978,9 @@
       <w:pPr>
         <w:pStyle w:val="Heading2"/>
       </w:pPr>
-      <w:bookmarkStart w:id="11" w:name="_Toc236299295"/>
-      <w:r>
-        <w:t>Aspect #</w:t>
-      </w:r>
-      <w:r>
-        <w:t>2</w:t>
+      <w:bookmarkStart w:id="11" w:name="_Toc236308628"/>
+      <w:r>
+        <w:t>Aspect #2</w:t>
       </w:r>
       <w:bookmarkEnd w:id="11"/>
     </w:p>
@@ -3030,7 +2993,7 @@
       <w:pPr>
         <w:pStyle w:val="Heading3"/>
       </w:pPr>
-      <w:bookmarkStart w:id="12" w:name="_Toc236299296"/>
+      <w:bookmarkStart w:id="12" w:name="_Toc236308629"/>
       <w:r>
         <w:t>Sub-Aspect 2.1</w:t>
       </w:r>
@@ -3050,7 +3013,7 @@
       <w:pPr>
         <w:pStyle w:val="Heading1"/>
       </w:pPr>
-      <w:bookmarkStart w:id="13" w:name="_Toc236299297"/>
+      <w:bookmarkStart w:id="13" w:name="_Toc236308630"/>
       <w:r>
         <w:lastRenderedPageBreak/>
         <w:t>Methodology: Research Design</w:t>
@@ -3061,7 +3024,7 @@
       <w:pPr>
         <w:pStyle w:val="Heading2"/>
       </w:pPr>
-      <w:bookmarkStart w:id="14" w:name="_Toc236299298"/>
+      <w:bookmarkStart w:id="14" w:name="_Toc236308631"/>
       <w:r>
         <w:t>Primary Research Methodology</w:t>
       </w:r>
@@ -3076,7 +3039,7 @@
       <w:pPr>
         <w:pStyle w:val="Heading2"/>
       </w:pPr>
-      <w:bookmarkStart w:id="15" w:name="_Toc236299299"/>
+      <w:bookmarkStart w:id="15" w:name="_Toc236308632"/>
       <w:r>
         <w:t>Secondary Research Methodology</w:t>
       </w:r>
@@ -3091,7 +3054,7 @@
       <w:pPr>
         <w:pStyle w:val="Heading2"/>
       </w:pPr>
-      <w:bookmarkStart w:id="16" w:name="_Toc236299300"/>
+      <w:bookmarkStart w:id="16" w:name="_Toc236308633"/>
       <w:r>
         <w:t>Limitations</w:t>
       </w:r>
@@ -3106,7 +3069,7 @@
       <w:pPr>
         <w:pStyle w:val="Heading2"/>
       </w:pPr>
-      <w:bookmarkStart w:id="17" w:name="_Toc236299301"/>
+      <w:bookmarkStart w:id="17" w:name="_Toc236308634"/>
       <w:r>
         <w:t>The Analysis Methods</w:t>
       </w:r>
@@ -3121,7 +3084,7 @@
       <w:pPr>
         <w:pStyle w:val="Heading2"/>
       </w:pPr>
-      <w:bookmarkStart w:id="18" w:name="_Toc236299302"/>
+      <w:bookmarkStart w:id="18" w:name="_Toc236308635"/>
       <w:r>
         <w:t>Response Rate</w:t>
       </w:r>
@@ -3141,7 +3104,7 @@
       <w:pPr>
         <w:pStyle w:val="Heading1"/>
       </w:pPr>
-      <w:bookmarkStart w:id="19" w:name="_Toc236299303"/>
+      <w:bookmarkStart w:id="19" w:name="_Toc236308636"/>
       <w:r>
         <w:lastRenderedPageBreak/>
         <w:t>Empirical Findings</w:t>
@@ -3152,7 +3115,7 @@
       <w:pPr>
         <w:pStyle w:val="Heading2"/>
       </w:pPr>
-      <w:bookmarkStart w:id="20" w:name="_Toc236299304"/>
+      <w:bookmarkStart w:id="20" w:name="_Toc236308637"/>
       <w:r>
         <w:t>Questionnaire Findings Regarding XYZ</w:t>
       </w:r>
@@ -3170,28 +3133,22 @@
       <w:pPr>
         <w:pStyle w:val="Heading2"/>
       </w:pPr>
-      <w:bookmarkStart w:id="21" w:name="_Toc236299305"/>
-      <w:r>
-        <w:t xml:space="preserve">Questionnaire Findings Regarding </w:t>
-      </w:r>
-      <w:r>
-        <w:t>ABC</w:t>
+      <w:bookmarkStart w:id="21" w:name="_Toc236308638"/>
+      <w:r>
+        <w:t>Questionnaire Findings Regarding ABC</w:t>
       </w:r>
       <w:bookmarkEnd w:id="21"/>
     </w:p>
     <w:p>
       <w:r>
-        <w:t>Describe the findings</w:t>
-      </w:r>
-      <w:r>
-        <w:t xml:space="preserve"> ABC</w:t>
+        <w:t>Describe the findings ABC</w:t>
       </w:r>
     </w:p>
     <w:p>
       <w:pPr>
         <w:pStyle w:val="Heading2"/>
       </w:pPr>
-      <w:bookmarkStart w:id="22" w:name="_Toc236299306"/>
+      <w:bookmarkStart w:id="22" w:name="_Toc236308639"/>
       <w:r>
         <w:t>Other Findings</w:t>
       </w:r>
@@ -3211,7 +3168,7 @@
       <w:pPr>
         <w:pStyle w:val="Heading1"/>
       </w:pPr>
-      <w:bookmarkStart w:id="23" w:name="_Toc236299307"/>
+      <w:bookmarkStart w:id="23" w:name="_Toc236308640"/>
       <w:r>
         <w:lastRenderedPageBreak/>
         <w:t>Conclusions and Recommendations</w:t>
@@ -3222,7 +3179,7 @@
       <w:pPr>
         <w:pStyle w:val="Heading2"/>
       </w:pPr>
-      <w:bookmarkStart w:id="24" w:name="_Toc236299308"/>
+      <w:bookmarkStart w:id="24" w:name="_Toc236308641"/>
       <w:r>
         <w:t>Conclusions</w:t>
       </w:r>
@@ -3237,7 +3194,7 @@
       <w:pPr>
         <w:pStyle w:val="Heading2"/>
       </w:pPr>
-      <w:bookmarkStart w:id="25" w:name="_Toc236299309"/>
+      <w:bookmarkStart w:id="25" w:name="_Toc236308642"/>
       <w:r>
         <w:t>Recommendations</w:t>
       </w:r>
@@ -3252,7 +3209,7 @@
       <w:pPr>
         <w:pStyle w:val="Heading2"/>
       </w:pPr>
-      <w:bookmarkStart w:id="26" w:name="_Toc236299310"/>
+      <w:bookmarkStart w:id="26" w:name="_Toc236308643"/>
       <w:r>
         <w:t>Reflection on the Dissertation Process</w:t>
       </w:r>
@@ -3267,7 +3224,7 @@
       <w:pPr>
         <w:pStyle w:val="Heading2"/>
       </w:pPr>
-      <w:bookmarkStart w:id="27" w:name="_Toc236299311"/>
+      <w:bookmarkStart w:id="27" w:name="_Toc236308644"/>
       <w:r>
         <w:t>Areas for Further Research</w:t>
       </w:r>
@@ -3283,27 +3240,29 @@
         <w:br w:type="page"/>
       </w:r>
     </w:p>
-    <w:bookmarkStart w:id="28" w:name="_Toc236299312" w:displacedByCustomXml="next"/>
+    <w:bookmarkStart w:id="28" w:name="_Toc236308645" w:displacedByCustomXml="next"/>
     <w:sdt>
       <w:sdtPr>
+        <w:rPr>
+          <w:rFonts w:asciiTheme="minorHAnsi" w:eastAsiaTheme="minorHAnsi" w:hAnsiTheme="minorHAnsi" w:cstheme="minorBidi"/>
+          <w:color w:val="auto"/>
+          <w:sz w:val="24"/>
+          <w:szCs w:val="24"/>
+        </w:rPr>
         <w:id w:val="-1908527386"/>
         <w:docPartObj>
           <w:docPartGallery w:val="Bibliographies"/>
           <w:docPartUnique/>
         </w:docPartObj>
       </w:sdtPr>
-      <w:sdtEndPr>
-        <w:rPr>
-          <w:rFonts w:asciiTheme="minorHAnsi" w:eastAsiaTheme="minorHAnsi" w:hAnsiTheme="minorHAnsi" w:cstheme="minorBidi"/>
-          <w:color w:val="auto"/>
-          <w:sz w:val="24"/>
-          <w:szCs w:val="24"/>
-        </w:rPr>
-      </w:sdtEndPr>
       <w:sdtContent>
         <w:p>
           <w:pPr>
             <w:pStyle w:val="Heading1"/>
+            <w:numPr>
+              <w:ilvl w:val="0"/>
+              <w:numId w:val="0"/>
+            </w:numPr>
           </w:pPr>
           <w:r>
             <w:t>Bibliography</w:t>
@@ -3364,8 +3323,12 @@
     <w:p>
       <w:pPr>
         <w:pStyle w:val="Heading1"/>
-      </w:pPr>
-      <w:bookmarkStart w:id="29" w:name="_Toc236299313"/>
+        <w:numPr>
+          <w:ilvl w:val="0"/>
+          <w:numId w:val="0"/>
+        </w:numPr>
+      </w:pPr>
+      <w:bookmarkStart w:id="29" w:name="_Toc236308646"/>
       <w:r>
         <w:lastRenderedPageBreak/>
         <w:t>Appendices</w:t>
@@ -4622,6 +4585,7 @@
   <w:style w:type="character" w:default="1" w:styleId="DefaultParagraphFont">
     <w:name w:val="Default Paragraph Font"/>
     <w:uiPriority w:val="1"/>
+    <w:semiHidden/>
     <w:unhideWhenUsed/>
   </w:style>
   <w:style w:type="table" w:default="1" w:styleId="TableNormal">

</xml_diff>